<commit_message>
Trackers: buyer-page fixes applied; two audit findings withdrawn
</commit_message>
<xml_diff>
--- a/research/Buyer_Pages_Link_Audit_2026-08-13.docx
+++ b/research/Buyer_Pages_Link_Audit_2026-08-13.docx
@@ -240,44 +240,41 @@
               <w:rPr>
                 <w:b/>
               </w:rPr>
-              <w:t xml:space="preserve">1 stale figure</w:t>
-            </w:r>
-            <w:r>
-              <w:t xml:space="preserve"> on the live prospectus</w:t>
-            </w:r>
-          </w:p>
-        </w:tc>
-      </w:tr>
-      <w:tr>
-        <w:tc>
-          <w:tcPr>
-            <w:tcW w:w="4680" w:type="dxa"/>
-          </w:tcPr>
-          <w:p>
-            <w:pPr>
-              <w:spacing w:after="0"/>
-            </w:pPr>
-            <w:r>
-              <w:rPr>
-                <w:b/>
-              </w:rPr>
-              <w:t xml:space="preserve">My own error</w:t>
-            </w:r>
-          </w:p>
-        </w:tc>
-        <w:tc>
-          <w:tcPr>
-            <w:tcW w:w="4680" w:type="dxa"/>
-          </w:tcPr>
-          <w:p>
-            <w:pPr>
-              <w:spacing w:after="0"/>
-            </w:pPr>
-            <w:r>
-              <w:rPr>
-                <w:b/>
-              </w:rPr>
-              <w:t xml:space="preserve">1 figure I have been under-reporting all session</w:t>
+              <w:t xml:space="preserve">NONE. My finding was wrong, see section 8</w:t>
+            </w:r>
+          </w:p>
+        </w:tc>
+      </w:tr>
+      <w:tr>
+        <w:tc>
+          <w:tcPr>
+            <w:tcW w:w="4680" w:type="dxa"/>
+          </w:tcPr>
+          <w:p>
+            <w:pPr>
+              <w:spacing w:after="0"/>
+            </w:pPr>
+            <w:r>
+              <w:rPr>
+                <w:b/>
+              </w:rPr>
+              <w:t xml:space="preserve">My own errors</w:t>
+            </w:r>
+          </w:p>
+        </w:tc>
+        <w:tc>
+          <w:tcPr>
+            <w:tcW w:w="4680" w:type="dxa"/>
+          </w:tcPr>
+          <w:p>
+            <w:pPr>
+              <w:spacing w:after="0"/>
+            </w:pPr>
+            <w:r>
+              <w:rPr>
+                <w:b/>
+              </w:rPr>
+              <w:t xml:space="preserve">2, both corrected: an under-reported panel figure, and a claim-drift finding that was not real</w:t>
             </w:r>
           </w:p>
         </w:tc>
@@ -328,7 +325,7 @@
         <w:t xml:space="preserve">acquisition-9f3c2a7d4b.html</w:t>
       </w:r>
       <w:r>
-        <w:t xml:space="preserve"> (20,074 bytes) — </w:t>
+        <w:t xml:space="preserve"> (20,074 bytes): </w:t>
       </w:r>
       <w:r>
         <w:rPr>
@@ -506,7 +503,7 @@
         <w:t xml:space="preserve">vp-7c1f9a4e8d2b6035.html</w:t>
       </w:r>
       <w:r>
-        <w:t xml:space="preserve"> (39,035 bytes) — </w:t>
+        <w:t xml:space="preserve"> (39,035 bytes): </w:t>
       </w:r>
       <w:r>
         <w:rPr>
@@ -731,7 +728,7 @@
         <w:t xml:space="preserve">enterprise.html</w:t>
       </w:r>
       <w:r>
-        <w:t xml:space="preserve"> (63,297 bytes) — </w:t>
+        <w:t xml:space="preserve"> (63,297 bytes): </w:t>
       </w:r>
       <w:r>
         <w:rPr>
@@ -2699,6 +2696,456 @@
           <w:b/>
         </w:rPr>
         <w:t xml:space="preserve">No change has been made to any buyer-facing page in this pass.</w:t>
+      </w:r>
+    </w:p>
+    <w:p>
+      <w:pPr>
+        <w:pBdr>
+          <w:bottom w:val="single" w:sz="6" w:space="1" w:color="AAAAAA"/>
+        </w:pBdr>
+      </w:pPr>
+    </w:p>
+    <w:p>
+      <w:pPr>
+        <w:pStyle w:val="Heading2"/>
+        <w:spacing w:after="140"/>
+      </w:pPr>
+      <w:r>
+        <w:t xml:space="preserve">8. CORRECTION TO THIS AUDIT, same day</w:t>
+      </w:r>
+    </w:p>
+    <w:p>
+      <w:pPr>
+        <w:spacing w:after="140"/>
+      </w:pPr>
+      <w:r>
+        <w:rPr>
+          <w:b/>
+        </w:rPr>
+        <w:t xml:space="preserve">Two of my five findings were wrong, and both were the same mistake: I read the HTML source instead of the rendered page.</w:t>
+      </w:r>
+    </w:p>
+    <w:p>
+      <w:pPr>
+        <w:spacing w:after="140"/>
+      </w:pPr>
+      <w:r>
+        <w:rPr>
+          <w:b/>
+        </w:rPr>
+        <w:t xml:space="preserve">Finding 4, "claim drift, 46 vs 48": WRONG.</w:t>
+      </w:r>
+      <w:r>
+        <w:t xml:space="preserve"> The prospectus already pulls panel figures live from </w:t>
+      </w:r>
+      <w:r>
+        <w:rPr>
+          <w:rFonts w:ascii="Consolas" w:hAnsi="Consolas"/>
+        </w:rPr>
+        <w:t xml:space="preserve">/api/panel-stats</w:t>
+      </w:r>
+      <w:r>
+        <w:t xml:space="preserve"> through a </w:t>
+      </w:r>
+      <w:r>
+        <w:rPr>
+          <w:rFonts w:ascii="Consolas" w:hAnsi="Consolas"/>
+        </w:rPr>
+        <w:t xml:space="preserve">data-panel</w:t>
+      </w:r>
+      <w:r>
+        <w:t xml:space="preserve"> mechanism built before this audit. </w:t>
+      </w:r>
+      <w:r>
+        <w:rPr>
+          <w:b/>
+        </w:rPr>
+        <w:t xml:space="preserve">The rendered page has always shown 48.</w:t>
+      </w:r>
+      <w:r>
+        <w:t xml:space="preserve"> The </w:t>
+      </w:r>
+      <w:r>
+        <w:rPr>
+          <w:rFonts w:ascii="Consolas" w:hAnsi="Consolas"/>
+        </w:rPr>
+        <w:t xml:space="preserve">46</w:t>
+      </w:r>
+      <w:r>
+        <w:t xml:space="preserve"> in the markup is the no-fetch fallback and is never displayed when the endpoint responds. Confirmed by rendering the page in a browser against the live endpoint: </w:t>
+      </w:r>
+      <w:r>
+        <w:rPr>
+          <w:rFonts w:ascii="Consolas" w:hAnsi="Consolas"/>
+        </w:rPr>
+        <w:t xml:space="preserve">registered 48, completers 36</w:t>
+      </w:r>
+      <w:r>
+        <w:t xml:space="preserve">. The fallback was updated to 48 anyway, so a failed fetch shows a current number.</w:t>
+      </w:r>
+    </w:p>
+    <w:p>
+      <w:pPr>
+        <w:spacing w:after="140"/>
+      </w:pPr>
+      <w:r>
+        <w:rPr>
+          <w:b/>
+        </w:rPr>
+        <w:t xml:space="preserve">Finding 5, "pull panel figures live": ALREADY BUILT.</w:t>
+      </w:r>
+      <w:r>
+        <w:t xml:space="preserve"> Withdrawn rather than implemented a second time.</w:t>
+      </w:r>
+    </w:p>
+    <w:p>
+      <w:pPr>
+        <w:spacing w:after="140"/>
+      </w:pPr>
+      <w:r>
+        <w:rPr>
+          <w:b/>
+        </w:rPr>
+        <w:t xml:space="preserve">This is the third time in this repository that checking source rather than rendered output has produced a false finding.</w:t>
+      </w:r>
+      <w:r>
+        <w:t xml:space="preserve"> The rule already recorded, verification ends at the rendered DOM, applies to audits of my own as much as to metric repairs.</w:t>
+      </w:r>
+    </w:p>
+    <w:p>
+      <w:pPr>
+        <w:pStyle w:val="Heading3"/>
+        <w:spacing w:after="140"/>
+      </w:pPr>
+      <w:r>
+        <w:t xml:space="preserve">What WAS applied</w:t>
+      </w:r>
+    </w:p>
+    <w:tbl>
+      <w:tblPr>
+        <w:tblStyle w:val="TableGrid"/>
+        <w:tblW w:w="9360" w:type="dxa"/>
+        <w:tblBorders>
+          <w:top w:val="single" w:sz="4" w:space="0" w:color="999999"/>
+          <w:left w:val="single" w:sz="4" w:space="0" w:color="999999"/>
+          <w:bottom w:val="single" w:sz="4" w:space="0" w:color="999999"/>
+          <w:right w:val="single" w:sz="4" w:space="0" w:color="999999"/>
+          <w:insideH w:val="single" w:sz="4" w:space="0" w:color="999999"/>
+          <w:insideV w:val="single" w:sz="4" w:space="0" w:color="999999"/>
+        </w:tblBorders>
+      </w:tblPr>
+      <w:tblGrid>
+        <w:gridCol w:w="4680"/>
+        <w:gridCol w:w="4680"/>
+      </w:tblGrid>
+      <w:tr>
+        <w:tc>
+          <w:tcPr>
+            <w:tcW w:w="4680" w:type="dxa"/>
+          </w:tcPr>
+          <w:p>
+            <w:pPr>
+              <w:spacing w:after="0"/>
+            </w:pPr>
+            <w:r>
+              <w:t xml:space="preserve">Fix</w:t>
+            </w:r>
+          </w:p>
+        </w:tc>
+        <w:tc>
+          <w:tcPr>
+            <w:tcW w:w="4680" w:type="dxa"/>
+          </w:tcPr>
+          <w:p>
+            <w:pPr>
+              <w:spacing w:after="0"/>
+            </w:pPr>
+            <w:r>
+              <w:t xml:space="preserve">Status</w:t>
+            </w:r>
+          </w:p>
+        </w:tc>
+      </w:tr>
+      <w:tr>
+        <w:tc>
+          <w:tcPr>
+            <w:tcW w:w="4680" w:type="dxa"/>
+          </w:tcPr>
+          <w:p>
+            <w:pPr>
+              <w:spacing w:after="0"/>
+            </w:pPr>
+            <w:r>
+              <w:t xml:space="preserve">Section 11 "See It For Yourself" on the prospectus</w:t>
+            </w:r>
+          </w:p>
+        </w:tc>
+        <w:tc>
+          <w:tcPr>
+            <w:tcW w:w="4680" w:type="dxa"/>
+          </w:tcPr>
+          <w:p>
+            <w:pPr>
+              <w:spacing w:after="0"/>
+            </w:pPr>
+            <w:r>
+              <w:rPr>
+                <w:b/>
+              </w:rPr>
+              <w:t xml:space="preserve">APPLIED.</w:t>
+            </w:r>
+            <w:r>
+              <w:t xml:space="preserve"> Anchors </w:t>
+            </w:r>
+            <w:r>
+              <w:rPr>
+                <w:b/>
+              </w:rPr>
+              <w:t xml:space="preserve">2 to 8</w:t>
+            </w:r>
+          </w:p>
+        </w:tc>
+      </w:tr>
+      <w:tr>
+        <w:tc>
+          <w:tcPr>
+            <w:tcW w:w="4680" w:type="dxa"/>
+          </w:tcPr>
+          <w:p>
+            <w:pPr>
+              <w:spacing w:after="0"/>
+            </w:pPr>
+            <w:r>
+              <w:t xml:space="preserve">Links: Field Guides, training, vendor preview, OpenAPI, Standard PDF, simulations</w:t>
+            </w:r>
+          </w:p>
+        </w:tc>
+        <w:tc>
+          <w:tcPr>
+            <w:tcW w:w="4680" w:type="dxa"/>
+          </w:tcPr>
+          <w:p>
+            <w:pPr>
+              <w:spacing w:after="0"/>
+            </w:pPr>
+            <w:r>
+              <w:rPr>
+                <w:b/>
+              </w:rPr>
+              <w:t xml:space="preserve">APPLIED</w:t>
+            </w:r>
+            <w:r>
+              <w:t xml:space="preserve">, all 200</w:t>
+            </w:r>
+          </w:p>
+        </w:tc>
+      </w:tr>
+      <w:tr>
+        <w:tc>
+          <w:tcPr>
+            <w:tcW w:w="4680" w:type="dxa"/>
+          </w:tcPr>
+          <w:p>
+            <w:pPr>
+              <w:spacing w:after="0"/>
+            </w:pPr>
+            <w:r>
+              <w:t xml:space="preserve">Validation Report link</w:t>
+            </w:r>
+          </w:p>
+        </w:tc>
+        <w:tc>
+          <w:tcPr>
+            <w:tcW w:w="4680" w:type="dxa"/>
+          </w:tcPr>
+          <w:p>
+            <w:pPr>
+              <w:spacing w:after="0"/>
+            </w:pPr>
+            <w:r>
+              <w:rPr>
+                <w:b/>
+              </w:rPr>
+              <w:t xml:space="preserve">DELIBERATELY NOT APPLIED.</w:t>
+            </w:r>
+            <w:r>
+              <w:t xml:space="preserve"> Its own confidentiality statement reads "not for public distribution" and guardrail 1 requires an NDA before specifics. The section names it and offers it under NDA</w:t>
+            </w:r>
+          </w:p>
+        </w:tc>
+      </w:tr>
+      <w:tr>
+        <w:tc>
+          <w:tcPr>
+            <w:tcW w:w="4680" w:type="dxa"/>
+          </w:tcPr>
+          <w:p>
+            <w:pPr>
+              <w:spacing w:after="0"/>
+            </w:pPr>
+            <w:r>
+              <w:t xml:space="preserve">Cross-link vendor preview to prospectus</w:t>
+            </w:r>
+          </w:p>
+        </w:tc>
+        <w:tc>
+          <w:tcPr>
+            <w:tcW w:w="4680" w:type="dxa"/>
+          </w:tcPr>
+          <w:p>
+            <w:pPr>
+              <w:spacing w:after="0"/>
+            </w:pPr>
+            <w:r>
+              <w:rPr>
+                <w:b/>
+              </w:rPr>
+              <w:t xml:space="preserve">APPLIED</w:t>
+            </w:r>
+          </w:p>
+        </w:tc>
+      </w:tr>
+      <w:tr>
+        <w:tc>
+          <w:tcPr>
+            <w:tcW w:w="4680" w:type="dxa"/>
+          </w:tcPr>
+          <w:p>
+            <w:pPr>
+              <w:spacing w:after="0"/>
+            </w:pPr>
+            <w:r>
+              <w:t xml:space="preserve">Fallback figure 46 to 48</w:t>
+            </w:r>
+          </w:p>
+        </w:tc>
+        <w:tc>
+          <w:tcPr>
+            <w:tcW w:w="4680" w:type="dxa"/>
+          </w:tcPr>
+          <w:p>
+            <w:pPr>
+              <w:spacing w:after="0"/>
+            </w:pPr>
+            <w:r>
+              <w:rPr>
+                <w:b/>
+              </w:rPr>
+              <w:t xml:space="preserve">APPLIED</w:t>
+            </w:r>
+          </w:p>
+        </w:tc>
+      </w:tr>
+      <w:tr>
+        <w:tc>
+          <w:tcPr>
+            <w:tcW w:w="4680" w:type="dxa"/>
+          </w:tcPr>
+          <w:p>
+            <w:pPr>
+              <w:spacing w:after="0"/>
+            </w:pPr>
+            <w:r>
+              <w:t xml:space="preserve">Live panel figures</w:t>
+            </w:r>
+          </w:p>
+        </w:tc>
+        <w:tc>
+          <w:tcPr>
+            <w:tcW w:w="4680" w:type="dxa"/>
+          </w:tcPr>
+          <w:p>
+            <w:pPr>
+              <w:spacing w:after="0"/>
+            </w:pPr>
+            <w:r>
+              <w:rPr>
+                <w:b/>
+              </w:rPr>
+              <w:t xml:space="preserve">ALREADY EXISTED</w:t>
+            </w:r>
+            <w:r>
+              <w:t xml:space="preserve">, withdrawn</w:t>
+            </w:r>
+          </w:p>
+        </w:tc>
+      </w:tr>
+    </w:tbl>
+    <w:p>
+      <w:pPr/>
+      <w:r>
+        <w:t/>
+      </w:r>
+    </w:p>
+    <w:p>
+      <w:pPr>
+        <w:pStyle w:val="Heading3"/>
+        <w:spacing w:after="140"/>
+      </w:pPr>
+      <w:r>
+        <w:t xml:space="preserve">A defect caught before it shipped</w:t>
+      </w:r>
+    </w:p>
+    <w:p>
+      <w:pPr>
+        <w:spacing w:after="140"/>
+      </w:pPr>
+      <w:r>
+        <w:t xml:space="preserve">A draft link to </w:t>
+      </w:r>
+      <w:r>
+        <w:rPr>
+          <w:rFonts w:ascii="Consolas" w:hAnsi="Consolas"/>
+        </w:rPr>
+        <w:t xml:space="preserve">mccr-simulator.html</w:t>
+      </w:r>
+      <w:r>
+        <w:t xml:space="preserve"> </w:t>
+      </w:r>
+      <w:r>
+        <w:rPr>
+          <w:b/>
+        </w:rPr>
+        <w:t xml:space="preserve">failed the on-disk check</w:t>
+      </w:r>
+      <w:r>
+        <w:t xml:space="preserve">. That file does not exist and returns </w:t>
+      </w:r>
+      <w:r>
+        <w:rPr>
+          <w:b/>
+        </w:rPr>
+        <w:t xml:space="preserve">404</w:t>
+      </w:r>
+      <w:r>
+        <w:t xml:space="preserve">, yet it was listed in the </w:t>
+      </w:r>
+      <w:r>
+        <w:rPr>
+          <w:rFonts w:ascii="Consolas" w:hAnsi="Consolas"/>
+        </w:rPr>
+        <w:t xml:space="preserve">CLAUDE.md</w:t>
+      </w:r>
+      <w:r>
+        <w:t xml:space="preserve"> platform map. The link was changed to </w:t>
+      </w:r>
+      <w:r>
+        <w:rPr>
+          <w:rFonts w:ascii="Consolas" w:hAnsi="Consolas"/>
+        </w:rPr>
+        <w:t xml:space="preserve">simulations.html</w:t>
+      </w:r>
+      <w:r>
+        <w:t xml:space="preserve"> and </w:t>
+      </w:r>
+      <w:r>
+        <w:rPr>
+          <w:b/>
+        </w:rPr>
+        <w:t xml:space="preserve">the stale entry was removed from `CLAUDE.md`</w:t>
+      </w:r>
+      <w:r>
+        <w:t xml:space="preserve">. I nearly shipped the exact defect this audit exists to find.</w:t>
       </w:r>
     </w:p>
     <w:sectPr>

</xml_diff>